<commit_message>
chore: aggiorna BUILD_DATE service worker + template Word (01/03/2026)
</commit_message>
<xml_diff>
--- a/app/public/templates/ISO9001-audit-report.docx
+++ b/app/public/templates/ISO9001-audit-report.docx
@@ -16,7 +16,6 @@
         <w:alias w:val="Sommario"/>
         <w:id w:val="-1882235383"/>
       </w:sdtPr>
-      <w:sdtEndPr/>
       <w:sdtContent>
         <w:p>
           <w:r>
@@ -1018,8 +1017,8 @@
       </w:r>
     </w:p>
     <w:sectPr>
-      <w:headerReference w:type="default" r:id="rId7"/>
-      <w:footerReference w:type="default" r:id="rId8"/>
+      <w:headerReference w:type="default" r:id="rId8"/>
+      <w:footerReference w:type="default" r:id="rId9"/>
       <w:pgSz w:w="11906" w:h="16838"/>
       <w:pgMar w:top="2200" w:right="1440" w:bottom="1440" w:left="1440" w:header="400" w:footer="708" w:gutter="0"/>
       <w:cols w:space="720"/>
@@ -2460,4 +2459,16 @@
     </a:ext>
   </a:extLst>
 </a:theme>
+</file>
+
+<file path=customXml/item1.xml><?xml version="1.0" encoding="utf-8"?>
+<b:Sources xmlns:b="http://schemas.openxmlformats.org/officeDocument/2006/bibliography" xmlns="http://schemas.openxmlformats.org/officeDocument/2006/bibliography" SelectedStyle="\APASixthEditionOfficeOnline.xsl" StyleName="APA" Version="6"/>
+</file>
+
+<file path=customXml/itemProps1.xml><?xml version="1.0" encoding="utf-8"?>
+<ds:datastoreItem xmlns:ds="http://schemas.openxmlformats.org/officeDocument/2006/customXml" ds:itemID="{104825F6-D2CB-47DA-A88B-80C9BAC9FC1A}">
+  <ds:schemaRefs>
+    <ds:schemaRef ds:uri="http://schemas.openxmlformats.org/officeDocument/2006/bibliography"/>
+  </ds:schemaRefs>
+</ds:datastoreItem>
 </file>
</xml_diff>

<commit_message>
fix(word): mojibake titoli e sommario DOCX (ISO 9001)
Regex ponte tra run Word spezzati da proofErr/TOC; fix su footnotes/endnotes; dopo injectOoxmlMarkers e prima del blob; template ISO9001 e script fix-audit-template-mojibake.cjs; BUILD_DATE service worker.

Made-with: Cursor
</commit_message>
<xml_diff>
--- a/app/public/templates/ISO9001-audit-report.docx
+++ b/app/public/templates/ISO9001-audit-report.docx
@@ -105,7 +105,7 @@
                 <w:rStyle w:val="Collegamentoipertestuale"/>
                 <w:noProof/>
               </w:rPr>
-              <w:t>1 â€“ DATI GENERALI</w:t>
+              <w:t>1 – DATI GENERALI</w:t>
             </w:r>
             <w:r>
               <w:rPr>
@@ -474,11 +474,7 @@
       </w:pPr>
       <w:bookmarkStart w:id="1" w:name="_Toc224759897"/>
       <w:r>
-        <w:t>1 â</w:t>
-      </w:r>
-      <w:proofErr w:type="gramStart"/>
-      <w:r>
-        <w:t>€“ DATI</w:t>
+        <w:t>1 – DATI</w:t>
       </w:r>
       <w:proofErr w:type="gramEnd"/>
       <w:r>

</xml_diff>

<commit_message>
chore(template): aggiorna layout intestazione ISO9001-audit-report.docx
Co-authored-by: Cursor <cursoragent@cursor.com>
</commit_message>
<xml_diff>
--- a/app/public/templates/ISO9001-audit-report.docx
+++ b/app/public/templates/ISO9001-audit-report.docx
@@ -474,11 +474,7 @@
       </w:pPr>
       <w:bookmarkStart w:id="1" w:name="_Toc224759897"/>
       <w:r>
-        <w:t>1 – DATI</w:t>
-      </w:r>
-      <w:proofErr w:type="gramEnd"/>
-      <w:r>
-        <w:t xml:space="preserve"> GENERALI</w:t>
+        <w:t>1 – DATI GENERALI</w:t>
       </w:r>
       <w:bookmarkEnd w:id="1"/>
     </w:p>
@@ -968,12 +964,6 @@
         <w:gridCol w:w="6317"/>
       </w:tblGrid>
       <w:tr>
-        <w:tblPrEx>
-          <w:tblCellMar>
-            <w:top w:w="0" w:type="dxa"/>
-            <w:bottom w:w="0" w:type="dxa"/>
-          </w:tblCellMar>
-        </w:tblPrEx>
         <w:trPr>
           <w:tblHeader/>
         </w:trPr>
@@ -1027,12 +1017,6 @@
         </w:tc>
       </w:tr>
       <w:tr>
-        <w:tblPrEx>
-          <w:tblCellMar>
-            <w:top w:w="0" w:type="dxa"/>
-            <w:bottom w:w="0" w:type="dxa"/>
-          </w:tblCellMar>
-        </w:tblPrEx>
         <w:tc>
           <w:tcPr>
             <w:tcW w:w="1500" w:type="pct"/>
@@ -1202,12 +1186,6 @@
         <w:gridCol w:w="1529"/>
       </w:tblGrid>
       <w:tr>
-        <w:tblPrEx>
-          <w:tblCellMar>
-            <w:top w:w="0" w:type="dxa"/>
-            <w:bottom w:w="0" w:type="dxa"/>
-          </w:tblCellMar>
-        </w:tblPrEx>
         <w:tc>
           <w:tcPr>
             <w:tcW w:w="0" w:type="auto"/>
@@ -1295,12 +1273,6 @@
         </w:tc>
       </w:tr>
       <w:tr>
-        <w:tblPrEx>
-          <w:tblCellMar>
-            <w:top w:w="0" w:type="dxa"/>
-            <w:bottom w:w="0" w:type="dxa"/>
-          </w:tblCellMar>
-        </w:tblPrEx>
         <w:tc>
           <w:tcPr>
             <w:tcW w:w="0" w:type="auto"/>
@@ -1363,12 +1335,6 @@
         </w:tc>
       </w:tr>
       <w:tr>
-        <w:tblPrEx>
-          <w:tblCellMar>
-            <w:top w:w="0" w:type="dxa"/>
-            <w:bottom w:w="0" w:type="dxa"/>
-          </w:tblCellMar>
-        </w:tblPrEx>
         <w:tc>
           <w:tcPr>
             <w:tcW w:w="0" w:type="auto"/>
@@ -1449,12 +1415,6 @@
         </w:tc>
       </w:tr>
       <w:tr>
-        <w:tblPrEx>
-          <w:tblCellMar>
-            <w:top w:w="0" w:type="dxa"/>
-            <w:bottom w:w="0" w:type="dxa"/>
-          </w:tblCellMar>
-        </w:tblPrEx>
         <w:tc>
           <w:tcPr>
             <w:tcW w:w="0" w:type="auto"/>
@@ -1517,12 +1477,6 @@
         </w:tc>
       </w:tr>
       <w:tr>
-        <w:tblPrEx>
-          <w:tblCellMar>
-            <w:top w:w="0" w:type="dxa"/>
-            <w:bottom w:w="0" w:type="dxa"/>
-          </w:tblCellMar>
-        </w:tblPrEx>
         <w:tc>
           <w:tcPr>
             <w:tcW w:w="0" w:type="auto"/>
@@ -1585,12 +1539,6 @@
         </w:tc>
       </w:tr>
       <w:tr>
-        <w:tblPrEx>
-          <w:tblCellMar>
-            <w:top w:w="0" w:type="dxa"/>
-            <w:bottom w:w="0" w:type="dxa"/>
-          </w:tblCellMar>
-        </w:tblPrEx>
         <w:tc>
           <w:tcPr>
             <w:tcW w:w="0" w:type="auto"/>
@@ -1675,8 +1623,12 @@
       </w:r>
     </w:p>
     <w:sectPr>
-      <w:headerReference w:type="default" r:id="rId7"/>
-      <w:footerReference w:type="default" r:id="rId8"/>
+      <w:headerReference w:type="even" r:id="rId7"/>
+      <w:headerReference w:type="default" r:id="rId8"/>
+      <w:footerReference w:type="even" r:id="rId9"/>
+      <w:footerReference w:type="default" r:id="rId10"/>
+      <w:headerReference w:type="first" r:id="rId11"/>
+      <w:footerReference w:type="first" r:id="rId12"/>
       <w:pgSz w:w="11906" w:h="16838"/>
       <w:pgMar w:top="2200" w:right="1440" w:bottom="1440" w:left="1440" w:header="400" w:footer="708" w:gutter="0"/>
       <w:cols w:space="720"/>
@@ -1712,6 +1664,16 @@
 </file>
 
 <file path=word/footer1.xml><?xml version="1.0" encoding="utf-8"?>
+<w:ftr xmlns:wpc="http://schemas.microsoft.com/office/word/2010/wordprocessingCanvas" xmlns:cx="http://schemas.microsoft.com/office/drawing/2014/chartex" xmlns:cx1="http://schemas.microsoft.com/office/drawing/2015/9/8/chartex" xmlns:cx2="http://schemas.microsoft.com/office/drawing/2015/10/21/chartex" xmlns:cx3="http://schemas.microsoft.com/office/drawing/2016/5/9/chartex" xmlns:cx4="http://schemas.microsoft.com/office/drawing/2016/5/10/chartex" xmlns:cx5="http://schemas.microsoft.com/office/drawing/2016/5/11/chartex" xmlns:cx6="http://schemas.microsoft.com/office/drawing/2016/5/12/chartex" xmlns:cx7="http://schemas.microsoft.com/office/drawing/2016/5/13/chartex" xmlns:cx8="http://schemas.microsoft.com/office/drawing/2016/5/14/chartex" xmlns:mc="http://schemas.openxmlformats.org/markup-compatibility/2006" xmlns:aink="http://schemas.microsoft.com/office/drawing/2016/ink" xmlns:am3d="http://schemas.microsoft.com/office/drawing/2017/model3d" xmlns:o="urn:schemas-microsoft-com:office:office" xmlns:oel="http://schemas.microsoft.com/office/2019/extlst" xmlns:r="http://schemas.openxmlformats.org/officeDocument/2006/relationships" xmlns:m="http://schemas.openxmlformats.org/officeDocument/2006/math" xmlns:v="urn:schemas-microsoft-com:vml" xmlns:wp14="http://schemas.microsoft.com/office/word/2010/wordprocessingDrawing" xmlns:wp="http://schemas.openxmlformats.org/drawingml/2006/wordprocessingDrawing" xmlns:w10="urn:schemas-microsoft-com:office:word" xmlns:w="http://schemas.openxmlformats.org/wordprocessingml/2006/main" xmlns:w14="http://schemas.microsoft.com/office/word/2010/wordml" xmlns:w15="http://schemas.microsoft.com/office/word/2012/wordml" xmlns:w16cex="http://schemas.microsoft.com/office/word/2018/wordml/cex" xmlns:w16cid="http://schemas.microsoft.com/office/word/2016/wordml/cid" xmlns:w16="http://schemas.microsoft.com/office/word/2018/wordml" xmlns:w16du="http://schemas.microsoft.com/office/word/2023/wordml/word16du" xmlns:w16sdtdh="http://schemas.microsoft.com/office/word/2020/wordml/sdtdatahash" xmlns:w16sdtfl="http://schemas.microsoft.com/office/word/2024/wordml/sdtformatlock" xmlns:w16se="http://schemas.microsoft.com/office/word/2015/wordml/symex" xmlns:wpg="http://schemas.microsoft.com/office/word/2010/wordprocessingGroup" xmlns:wpi="http://schemas.microsoft.com/office/word/2010/wordprocessingInk" xmlns:wne="http://schemas.microsoft.com/office/word/2006/wordml" xmlns:wps="http://schemas.microsoft.com/office/word/2010/wordprocessingShape" mc:Ignorable="w14 w15 w16se w16cid w16 w16cex w16sdtdh w16sdtfl w16du wp14">
+  <w:p>
+    <w:pPr>
+      <w:pStyle w:val="Pidipagina"/>
+    </w:pPr>
+  </w:p>
+</w:ftr>
+</file>
+
+<file path=word/footer2.xml><?xml version="1.0" encoding="utf-8"?>
 <w:ftr xmlns:wpc="http://schemas.microsoft.com/office/word/2010/wordprocessingCanvas" xmlns:cx="http://schemas.microsoft.com/office/drawing/2014/chartex" xmlns:cx1="http://schemas.microsoft.com/office/drawing/2015/9/8/chartex" xmlns:cx2="http://schemas.microsoft.com/office/drawing/2015/10/21/chartex" xmlns:cx3="http://schemas.microsoft.com/office/drawing/2016/5/9/chartex" xmlns:cx4="http://schemas.microsoft.com/office/drawing/2016/5/10/chartex" xmlns:cx5="http://schemas.microsoft.com/office/drawing/2016/5/11/chartex" xmlns:cx6="http://schemas.microsoft.com/office/drawing/2016/5/12/chartex" xmlns:cx7="http://schemas.microsoft.com/office/drawing/2016/5/13/chartex" xmlns:cx8="http://schemas.microsoft.com/office/drawing/2016/5/14/chartex" xmlns:mc="http://schemas.openxmlformats.org/markup-compatibility/2006" xmlns:aink="http://schemas.microsoft.com/office/drawing/2016/ink" xmlns:am3d="http://schemas.microsoft.com/office/drawing/2017/model3d" xmlns:o="urn:schemas-microsoft-com:office:office" xmlns:oel="http://schemas.microsoft.com/office/2019/extlst" xmlns:r="http://schemas.openxmlformats.org/officeDocument/2006/relationships" xmlns:m="http://schemas.openxmlformats.org/officeDocument/2006/math" xmlns:v="urn:schemas-microsoft-com:vml" xmlns:wp14="http://schemas.microsoft.com/office/word/2010/wordprocessingDrawing" xmlns:wp="http://schemas.openxmlformats.org/drawingml/2006/wordprocessingDrawing" xmlns:w10="urn:schemas-microsoft-com:office:word" xmlns:w="http://schemas.openxmlformats.org/wordprocessingml/2006/main" xmlns:w14="http://schemas.microsoft.com/office/word/2010/wordml" xmlns:w15="http://schemas.microsoft.com/office/word/2012/wordml" xmlns:w16cex="http://schemas.microsoft.com/office/word/2018/wordml/cex" xmlns:w16cid="http://schemas.microsoft.com/office/word/2016/wordml/cid" xmlns:w16="http://schemas.microsoft.com/office/word/2018/wordml" xmlns:w16du="http://schemas.microsoft.com/office/word/2023/wordml/word16du" xmlns:w16sdtdh="http://schemas.microsoft.com/office/word/2020/wordml/sdtdatahash" xmlns:w16sdtfl="http://schemas.microsoft.com/office/word/2024/wordml/sdtformatlock" xmlns:w16se="http://schemas.microsoft.com/office/word/2015/wordml/symex" xmlns:wpg="http://schemas.microsoft.com/office/word/2010/wordprocessingGroup" xmlns:wpi="http://schemas.microsoft.com/office/word/2010/wordprocessingInk" xmlns:wne="http://schemas.microsoft.com/office/word/2006/wordml" xmlns:wps="http://schemas.microsoft.com/office/word/2010/wordprocessingShape" mc:Ignorable="w14 w15 w16se w16cid w16 w16cex w16sdtdh w16sdtfl w16du wp14">
   <w:p>
     <w:pPr>
@@ -1763,6 +1725,16 @@
 </w:ftr>
 </file>
 
+<file path=word/footer3.xml><?xml version="1.0" encoding="utf-8"?>
+<w:ftr xmlns:wpc="http://schemas.microsoft.com/office/word/2010/wordprocessingCanvas" xmlns:cx="http://schemas.microsoft.com/office/drawing/2014/chartex" xmlns:cx1="http://schemas.microsoft.com/office/drawing/2015/9/8/chartex" xmlns:cx2="http://schemas.microsoft.com/office/drawing/2015/10/21/chartex" xmlns:cx3="http://schemas.microsoft.com/office/drawing/2016/5/9/chartex" xmlns:cx4="http://schemas.microsoft.com/office/drawing/2016/5/10/chartex" xmlns:cx5="http://schemas.microsoft.com/office/drawing/2016/5/11/chartex" xmlns:cx6="http://schemas.microsoft.com/office/drawing/2016/5/12/chartex" xmlns:cx7="http://schemas.microsoft.com/office/drawing/2016/5/13/chartex" xmlns:cx8="http://schemas.microsoft.com/office/drawing/2016/5/14/chartex" xmlns:mc="http://schemas.openxmlformats.org/markup-compatibility/2006" xmlns:aink="http://schemas.microsoft.com/office/drawing/2016/ink" xmlns:am3d="http://schemas.microsoft.com/office/drawing/2017/model3d" xmlns:o="urn:schemas-microsoft-com:office:office" xmlns:oel="http://schemas.microsoft.com/office/2019/extlst" xmlns:r="http://schemas.openxmlformats.org/officeDocument/2006/relationships" xmlns:m="http://schemas.openxmlformats.org/officeDocument/2006/math" xmlns:v="urn:schemas-microsoft-com:vml" xmlns:wp14="http://schemas.microsoft.com/office/word/2010/wordprocessingDrawing" xmlns:wp="http://schemas.openxmlformats.org/drawingml/2006/wordprocessingDrawing" xmlns:w10="urn:schemas-microsoft-com:office:word" xmlns:w="http://schemas.openxmlformats.org/wordprocessingml/2006/main" xmlns:w14="http://schemas.microsoft.com/office/word/2010/wordml" xmlns:w15="http://schemas.microsoft.com/office/word/2012/wordml" xmlns:w16cex="http://schemas.microsoft.com/office/word/2018/wordml/cex" xmlns:w16cid="http://schemas.microsoft.com/office/word/2016/wordml/cid" xmlns:w16="http://schemas.microsoft.com/office/word/2018/wordml" xmlns:w16du="http://schemas.microsoft.com/office/word/2023/wordml/word16du" xmlns:w16sdtdh="http://schemas.microsoft.com/office/word/2020/wordml/sdtdatahash" xmlns:w16sdtfl="http://schemas.microsoft.com/office/word/2024/wordml/sdtformatlock" xmlns:w16se="http://schemas.microsoft.com/office/word/2015/wordml/symex" xmlns:wpg="http://schemas.microsoft.com/office/word/2010/wordprocessingGroup" xmlns:wpi="http://schemas.microsoft.com/office/word/2010/wordprocessingInk" xmlns:wne="http://schemas.microsoft.com/office/word/2006/wordml" xmlns:wps="http://schemas.microsoft.com/office/word/2010/wordprocessingShape" mc:Ignorable="w14 w15 w16se w16cid w16 w16cex w16sdtdh w16sdtfl w16du wp14">
+  <w:p>
+    <w:pPr>
+      <w:pStyle w:val="Pidipagina"/>
+    </w:pPr>
+  </w:p>
+</w:ftr>
+</file>
+
 <file path=word/footnotes.xml><?xml version="1.0" encoding="utf-8"?>
 <w:footnotes xmlns:wpc="http://schemas.microsoft.com/office/word/2010/wordprocessingCanvas" xmlns:cx="http://schemas.microsoft.com/office/drawing/2014/chartex" xmlns:cx1="http://schemas.microsoft.com/office/drawing/2015/9/8/chartex" xmlns:cx2="http://schemas.microsoft.com/office/drawing/2015/10/21/chartex" xmlns:cx3="http://schemas.microsoft.com/office/drawing/2016/5/9/chartex" xmlns:cx4="http://schemas.microsoft.com/office/drawing/2016/5/10/chartex" xmlns:cx5="http://schemas.microsoft.com/office/drawing/2016/5/11/chartex" xmlns:cx6="http://schemas.microsoft.com/office/drawing/2016/5/12/chartex" xmlns:cx7="http://schemas.microsoft.com/office/drawing/2016/5/13/chartex" xmlns:cx8="http://schemas.microsoft.com/office/drawing/2016/5/14/chartex" xmlns:mc="http://schemas.openxmlformats.org/markup-compatibility/2006" xmlns:aink="http://schemas.microsoft.com/office/drawing/2016/ink" xmlns:am3d="http://schemas.microsoft.com/office/drawing/2017/model3d" xmlns:o="urn:schemas-microsoft-com:office:office" xmlns:oel="http://schemas.microsoft.com/office/2019/extlst" xmlns:r="http://schemas.openxmlformats.org/officeDocument/2006/relationships" xmlns:m="http://schemas.openxmlformats.org/officeDocument/2006/math" xmlns:v="urn:schemas-microsoft-com:vml" xmlns:wp14="http://schemas.microsoft.com/office/word/2010/wordprocessingDrawing" xmlns:wp="http://schemas.openxmlformats.org/drawingml/2006/wordprocessingDrawing" xmlns:w10="urn:schemas-microsoft-com:office:word" xmlns:w="http://schemas.openxmlformats.org/wordprocessingml/2006/main" xmlns:w14="http://schemas.microsoft.com/office/word/2010/wordml" xmlns:w15="http://schemas.microsoft.com/office/word/2012/wordml" xmlns:w16cex="http://schemas.microsoft.com/office/word/2018/wordml/cex" xmlns:w16cid="http://schemas.microsoft.com/office/word/2016/wordml/cid" xmlns:w16="http://schemas.microsoft.com/office/word/2018/wordml" xmlns:w16du="http://schemas.microsoft.com/office/word/2023/wordml/word16du" xmlns:w16sdtdh="http://schemas.microsoft.com/office/word/2020/wordml/sdtdatahash" xmlns:w16sdtfl="http://schemas.microsoft.com/office/word/2024/wordml/sdtformatlock" xmlns:w16se="http://schemas.microsoft.com/office/word/2015/wordml/symex" xmlns:wpg="http://schemas.microsoft.com/office/word/2010/wordprocessingGroup" xmlns:wpi="http://schemas.microsoft.com/office/word/2010/wordprocessingInk" xmlns:wne="http://schemas.microsoft.com/office/word/2006/wordml" xmlns:wps="http://schemas.microsoft.com/office/word/2010/wordprocessingShape" mc:Ignorable="w14 w15 w16se w16cid w16 w16cex w16sdtdh w16sdtfl w16du wp14">
   <w:footnote w:type="separator" w:id="-1">
@@ -1790,6 +1762,16 @@
 
 <file path=word/header1.xml><?xml version="1.0" encoding="utf-8"?>
 <w:hdr xmlns:wpc="http://schemas.microsoft.com/office/word/2010/wordprocessingCanvas" xmlns:cx="http://schemas.microsoft.com/office/drawing/2014/chartex" xmlns:cx1="http://schemas.microsoft.com/office/drawing/2015/9/8/chartex" xmlns:cx2="http://schemas.microsoft.com/office/drawing/2015/10/21/chartex" xmlns:cx3="http://schemas.microsoft.com/office/drawing/2016/5/9/chartex" xmlns:cx4="http://schemas.microsoft.com/office/drawing/2016/5/10/chartex" xmlns:cx5="http://schemas.microsoft.com/office/drawing/2016/5/11/chartex" xmlns:cx6="http://schemas.microsoft.com/office/drawing/2016/5/12/chartex" xmlns:cx7="http://schemas.microsoft.com/office/drawing/2016/5/13/chartex" xmlns:cx8="http://schemas.microsoft.com/office/drawing/2016/5/14/chartex" xmlns:mc="http://schemas.openxmlformats.org/markup-compatibility/2006" xmlns:aink="http://schemas.microsoft.com/office/drawing/2016/ink" xmlns:am3d="http://schemas.microsoft.com/office/drawing/2017/model3d" xmlns:o="urn:schemas-microsoft-com:office:office" xmlns:oel="http://schemas.microsoft.com/office/2019/extlst" xmlns:r="http://schemas.openxmlformats.org/officeDocument/2006/relationships" xmlns:m="http://schemas.openxmlformats.org/officeDocument/2006/math" xmlns:v="urn:schemas-microsoft-com:vml" xmlns:wp14="http://schemas.microsoft.com/office/word/2010/wordprocessingDrawing" xmlns:wp="http://schemas.openxmlformats.org/drawingml/2006/wordprocessingDrawing" xmlns:w10="urn:schemas-microsoft-com:office:word" xmlns:w="http://schemas.openxmlformats.org/wordprocessingml/2006/main" xmlns:w14="http://schemas.microsoft.com/office/word/2010/wordml" xmlns:w15="http://schemas.microsoft.com/office/word/2012/wordml" xmlns:w16cex="http://schemas.microsoft.com/office/word/2018/wordml/cex" xmlns:w16cid="http://schemas.microsoft.com/office/word/2016/wordml/cid" xmlns:w16="http://schemas.microsoft.com/office/word/2018/wordml" xmlns:w16du="http://schemas.microsoft.com/office/word/2023/wordml/word16du" xmlns:w16sdtdh="http://schemas.microsoft.com/office/word/2020/wordml/sdtdatahash" xmlns:w16sdtfl="http://schemas.microsoft.com/office/word/2024/wordml/sdtformatlock" xmlns:w16se="http://schemas.microsoft.com/office/word/2015/wordml/symex" xmlns:wpg="http://schemas.microsoft.com/office/word/2010/wordprocessingGroup" xmlns:wpi="http://schemas.microsoft.com/office/word/2010/wordprocessingInk" xmlns:wne="http://schemas.microsoft.com/office/word/2006/wordml" xmlns:wps="http://schemas.microsoft.com/office/word/2010/wordprocessingShape" mc:Ignorable="w14 w15 w16se w16cid w16 w16cex w16sdtdh w16sdtfl w16du wp14">
+  <w:p>
+    <w:pPr>
+      <w:pStyle w:val="Intestazione"/>
+    </w:pPr>
+  </w:p>
+</w:hdr>
+</file>
+
+<file path=word/header2.xml><?xml version="1.0" encoding="utf-8"?>
+<w:hdr xmlns:wpc="http://schemas.microsoft.com/office/word/2010/wordprocessingCanvas" xmlns:cx="http://schemas.microsoft.com/office/drawing/2014/chartex" xmlns:cx1="http://schemas.microsoft.com/office/drawing/2015/9/8/chartex" xmlns:cx2="http://schemas.microsoft.com/office/drawing/2015/10/21/chartex" xmlns:cx3="http://schemas.microsoft.com/office/drawing/2016/5/9/chartex" xmlns:cx4="http://schemas.microsoft.com/office/drawing/2016/5/10/chartex" xmlns:cx5="http://schemas.microsoft.com/office/drawing/2016/5/11/chartex" xmlns:cx6="http://schemas.microsoft.com/office/drawing/2016/5/12/chartex" xmlns:cx7="http://schemas.microsoft.com/office/drawing/2016/5/13/chartex" xmlns:cx8="http://schemas.microsoft.com/office/drawing/2016/5/14/chartex" xmlns:mc="http://schemas.openxmlformats.org/markup-compatibility/2006" xmlns:aink="http://schemas.microsoft.com/office/drawing/2016/ink" xmlns:am3d="http://schemas.microsoft.com/office/drawing/2017/model3d" xmlns:o="urn:schemas-microsoft-com:office:office" xmlns:oel="http://schemas.microsoft.com/office/2019/extlst" xmlns:r="http://schemas.openxmlformats.org/officeDocument/2006/relationships" xmlns:m="http://schemas.openxmlformats.org/officeDocument/2006/math" xmlns:v="urn:schemas-microsoft-com:vml" xmlns:wp14="http://schemas.microsoft.com/office/word/2010/wordprocessingDrawing" xmlns:wp="http://schemas.openxmlformats.org/drawingml/2006/wordprocessingDrawing" xmlns:w10="urn:schemas-microsoft-com:office:word" xmlns:w="http://schemas.openxmlformats.org/wordprocessingml/2006/main" xmlns:w14="http://schemas.microsoft.com/office/word/2010/wordml" xmlns:w15="http://schemas.microsoft.com/office/word/2012/wordml" xmlns:w16cex="http://schemas.microsoft.com/office/word/2018/wordml/cex" xmlns:w16cid="http://schemas.microsoft.com/office/word/2016/wordml/cid" xmlns:w16="http://schemas.microsoft.com/office/word/2018/wordml" xmlns:w16du="http://schemas.microsoft.com/office/word/2023/wordml/word16du" xmlns:w16sdtdh="http://schemas.microsoft.com/office/word/2020/wordml/sdtdatahash" xmlns:w16sdtfl="http://schemas.microsoft.com/office/word/2024/wordml/sdtformatlock" xmlns:w16se="http://schemas.microsoft.com/office/word/2015/wordml/symex" xmlns:wpg="http://schemas.microsoft.com/office/word/2010/wordprocessingGroup" xmlns:wpi="http://schemas.microsoft.com/office/word/2010/wordprocessingInk" xmlns:wne="http://schemas.microsoft.com/office/word/2006/wordml" xmlns:wps="http://schemas.microsoft.com/office/word/2010/wordprocessingShape" mc:Ignorable="w14 w15 w16se w16cid w16 w16cex w16sdtdh w16sdtfl w16du wp14">
   <w:tbl>
     <w:tblPr>
       <w:tblW w:w="5000" w:type="pct"/>
@@ -1813,19 +1795,16 @@
       <w:gridCol w:w="2434"/>
     </w:tblGrid>
     <w:tr>
-      <w:tblPrEx>
-        <w:tblCellMar>
-          <w:top w:w="0" w:type="dxa"/>
-          <w:bottom w:w="0" w:type="dxa"/>
-        </w:tblCellMar>
-      </w:tblPrEx>
+      <w:trPr>
+        <w:trHeight w:val="576"/>
+      </w:trPr>
       <w:tc>
         <w:tcPr>
           <w:tcW w:w="900" w:type="pct"/>
+          <w:vMerge w:val="restart"/>
           <w:tcBorders>
             <w:top w:val="single" w:sz="4" w:space="0" w:color="2C3E50"/>
             <w:left w:val="single" w:sz="4" w:space="0" w:color="2C3E50"/>
-            <w:bottom w:val="single" w:sz="4" w:space="0" w:color="2C3E50"/>
             <w:right w:val="single" w:sz="2" w:space="0" w:color="E5E7EB"/>
           </w:tcBorders>
           <w:tcMar>
@@ -1873,6 +1852,7 @@
         <w:p>
           <w:pPr>
             <w:spacing w:before="40" w:after="20"/>
+            <w:jc w:val="center"/>
           </w:pPr>
           <w:r>
             <w:rPr>
@@ -1901,19 +1881,6 @@
             <w:t>}</w:t>
           </w:r>
         </w:p>
-        <w:p>
-          <w:pPr>
-            <w:spacing w:after="40"/>
-          </w:pPr>
-          <w:r>
-            <w:rPr>
-              <w:color w:val="34495E"/>
-              <w:sz w:val="18"/>
-              <w:szCs w:val="18"/>
-            </w:rPr>
-            <w:t>Check-List Interna Audit</w:t>
-          </w:r>
-        </w:p>
       </w:tc>
       <w:tc>
         <w:tcPr>
@@ -1921,7 +1888,6 @@
           <w:tcBorders>
             <w:top w:val="single" w:sz="4" w:space="0" w:color="2C3E50"/>
             <w:left w:val="nil"/>
-            <w:bottom w:val="single" w:sz="4" w:space="0" w:color="2C3E50"/>
             <w:right w:val="single" w:sz="4" w:space="0" w:color="2C3E50"/>
           </w:tcBorders>
           <w:tcMar>
@@ -1934,10 +1900,88 @@
         </w:tcPr>
         <w:p>
           <w:pPr>
+            <w:jc w:val="center"/>
+            <w:rPr>
+              <w:b/>
+              <w:bCs/>
+              <w:color w:val="9CA3AF"/>
+              <w:sz w:val="18"/>
+              <w:szCs w:val="18"/>
+            </w:rPr>
+          </w:pPr>
+          <w:r>
+            <w:rPr>
+              <w:b/>
+              <w:bCs/>
+              <w:color w:val="9CA3AF"/>
+              <w:sz w:val="18"/>
+              <w:szCs w:val="18"/>
+            </w:rPr>
+            <w:t>[LOGO_ORG]</w:t>
+          </w:r>
+        </w:p>
+      </w:tc>
+    </w:tr>
+    <w:tr>
+      <w:trPr>
+        <w:trHeight w:val="316"/>
+      </w:trPr>
+      <w:tc>
+        <w:tcPr>
+          <w:tcW w:w="900" w:type="pct"/>
+          <w:vMerge/>
+          <w:tcBorders>
+            <w:left w:val="single" w:sz="4" w:space="0" w:color="2C3E50"/>
+            <w:bottom w:val="single" w:sz="4" w:space="0" w:color="2C3E50"/>
+            <w:right w:val="single" w:sz="2" w:space="0" w:color="E5E7EB"/>
+          </w:tcBorders>
+          <w:tcMar>
+            <w:top w:w="60" w:type="dxa"/>
+            <w:left w:w="120" w:type="dxa"/>
+            <w:bottom w:w="60" w:type="dxa"/>
+            <w:right w:w="80" w:type="dxa"/>
+          </w:tcMar>
+          <w:vAlign w:val="center"/>
+        </w:tcPr>
+        <w:p>
+          <w:pPr>
+            <w:spacing w:before="60" w:after="60"/>
+            <w:jc w:val="center"/>
+            <w:rPr>
+              <w:b/>
+              <w:bCs/>
+              <w:color w:val="9CA3AF"/>
+              <w:sz w:val="18"/>
+              <w:szCs w:val="18"/>
+            </w:rPr>
+          </w:pPr>
+        </w:p>
+      </w:tc>
+      <w:tc>
+        <w:tcPr>
+          <w:tcW w:w="2750" w:type="pct"/>
+          <w:tcBorders>
+            <w:top w:val="single" w:sz="4" w:space="0" w:color="2C3E50"/>
+            <w:left w:val="nil"/>
+            <w:bottom w:val="single" w:sz="4" w:space="0" w:color="2C3E50"/>
+            <w:right w:val="single" w:sz="2" w:space="0" w:color="E5E7EB"/>
+          </w:tcBorders>
+          <w:tcMar>
+            <w:top w:w="60" w:type="dxa"/>
+            <w:left w:w="160" w:type="dxa"/>
+            <w:bottom w:w="60" w:type="dxa"/>
+            <w:right w:w="80" w:type="dxa"/>
+          </w:tcMar>
+          <w:vAlign w:val="center"/>
+        </w:tcPr>
+        <w:p>
+          <w:pPr>
             <w:spacing w:before="30" w:after="10"/>
             <w:jc w:val="center"/>
             <w:rPr>
-              <w:lang w:val="en-GB"/>
+              <w:b/>
+              <w:bCs/>
+              <w:color w:val="2C3E50"/>
             </w:rPr>
           </w:pPr>
           <w:r>
@@ -1975,14 +2019,17 @@
             </w:rPr>
             <w:t>}</w:t>
           </w:r>
-        </w:p>
-        <w:p>
-          <w:pPr>
-            <w:jc w:val="center"/>
+          <w:r>
             <w:rPr>
+              <w:b/>
+              <w:bCs/>
+              <w:color w:val="2C3E50"/>
+              <w:sz w:val="18"/>
+              <w:szCs w:val="18"/>
               <w:lang w:val="en-GB"/>
             </w:rPr>
-          </w:pPr>
+            <w:t xml:space="preserve"> </w:t>
+          </w:r>
           <w:r>
             <w:rPr>
               <w:sz w:val="16"/>
@@ -2010,10 +2057,33 @@
             <w:t>}</w:t>
           </w:r>
         </w:p>
+      </w:tc>
+      <w:tc>
+        <w:tcPr>
+          <w:tcW w:w="1350" w:type="pct"/>
+          <w:tcBorders>
+            <w:left w:val="nil"/>
+            <w:bottom w:val="single" w:sz="4" w:space="0" w:color="2C3E50"/>
+            <w:right w:val="single" w:sz="4" w:space="0" w:color="2C3E50"/>
+          </w:tcBorders>
+          <w:tcMar>
+            <w:top w:w="60" w:type="dxa"/>
+            <w:left w:w="80" w:type="dxa"/>
+            <w:bottom w:w="60" w:type="dxa"/>
+            <w:right w:w="120" w:type="dxa"/>
+          </w:tcMar>
+          <w:vAlign w:val="center"/>
+        </w:tcPr>
         <w:p>
           <w:pPr>
+            <w:spacing w:before="30" w:after="10"/>
             <w:jc w:val="center"/>
             <w:rPr>
+              <w:b/>
+              <w:bCs/>
+              <w:color w:val="2C3E50"/>
+              <w:sz w:val="18"/>
+              <w:szCs w:val="18"/>
               <w:lang w:val="en-GB"/>
             </w:rPr>
           </w:pPr>
@@ -2025,12 +2095,14 @@
             </w:rPr>
             <w:t>Rev.0</w:t>
           </w:r>
-        </w:p>
-        <w:p>
-          <w:pPr>
-            <w:spacing w:after="30"/>
-            <w:jc w:val="center"/>
-          </w:pPr>
+          <w:r>
+            <w:rPr>
+              <w:sz w:val="16"/>
+              <w:szCs w:val="16"/>
+              <w:lang w:val="en-GB"/>
+            </w:rPr>
+            <w:t xml:space="preserve"> </w:t>
+          </w:r>
           <w:r>
             <w:rPr>
               <w:sz w:val="16"/>
@@ -2058,6 +2130,16 @@
       </w:tc>
     </w:tr>
   </w:tbl>
+</w:hdr>
+</file>
+
+<file path=word/header3.xml><?xml version="1.0" encoding="utf-8"?>
+<w:hdr xmlns:wpc="http://schemas.microsoft.com/office/word/2010/wordprocessingCanvas" xmlns:cx="http://schemas.microsoft.com/office/drawing/2014/chartex" xmlns:cx1="http://schemas.microsoft.com/office/drawing/2015/9/8/chartex" xmlns:cx2="http://schemas.microsoft.com/office/drawing/2015/10/21/chartex" xmlns:cx3="http://schemas.microsoft.com/office/drawing/2016/5/9/chartex" xmlns:cx4="http://schemas.microsoft.com/office/drawing/2016/5/10/chartex" xmlns:cx5="http://schemas.microsoft.com/office/drawing/2016/5/11/chartex" xmlns:cx6="http://schemas.microsoft.com/office/drawing/2016/5/12/chartex" xmlns:cx7="http://schemas.microsoft.com/office/drawing/2016/5/13/chartex" xmlns:cx8="http://schemas.microsoft.com/office/drawing/2016/5/14/chartex" xmlns:mc="http://schemas.openxmlformats.org/markup-compatibility/2006" xmlns:aink="http://schemas.microsoft.com/office/drawing/2016/ink" xmlns:am3d="http://schemas.microsoft.com/office/drawing/2017/model3d" xmlns:o="urn:schemas-microsoft-com:office:office" xmlns:oel="http://schemas.microsoft.com/office/2019/extlst" xmlns:r="http://schemas.openxmlformats.org/officeDocument/2006/relationships" xmlns:m="http://schemas.openxmlformats.org/officeDocument/2006/math" xmlns:v="urn:schemas-microsoft-com:vml" xmlns:wp14="http://schemas.microsoft.com/office/word/2010/wordprocessingDrawing" xmlns:wp="http://schemas.openxmlformats.org/drawingml/2006/wordprocessingDrawing" xmlns:w10="urn:schemas-microsoft-com:office:word" xmlns:w="http://schemas.openxmlformats.org/wordprocessingml/2006/main" xmlns:w14="http://schemas.microsoft.com/office/word/2010/wordml" xmlns:w15="http://schemas.microsoft.com/office/word/2012/wordml" xmlns:w16cex="http://schemas.microsoft.com/office/word/2018/wordml/cex" xmlns:w16cid="http://schemas.microsoft.com/office/word/2016/wordml/cid" xmlns:w16="http://schemas.microsoft.com/office/word/2018/wordml" xmlns:w16du="http://schemas.microsoft.com/office/word/2023/wordml/word16du" xmlns:w16sdtdh="http://schemas.microsoft.com/office/word/2020/wordml/sdtdatahash" xmlns:w16sdtfl="http://schemas.microsoft.com/office/word/2024/wordml/sdtformatlock" xmlns:w16se="http://schemas.microsoft.com/office/word/2015/wordml/symex" xmlns:wpg="http://schemas.microsoft.com/office/word/2010/wordprocessingGroup" xmlns:wpi="http://schemas.microsoft.com/office/word/2010/wordprocessingInk" xmlns:wne="http://schemas.microsoft.com/office/word/2006/wordml" xmlns:wps="http://schemas.microsoft.com/office/word/2010/wordprocessingShape" mc:Ignorable="w14 w15 w16se w16cid w16 w16cex w16sdtdh w16sdtfl w16du wp14">
+  <w:p>
+    <w:pPr>
+      <w:pStyle w:val="Intestazione"/>
+    </w:pPr>
+  </w:p>
 </w:hdr>
 </file>
 
@@ -2650,7 +2732,6 @@
   <w:style w:type="character" w:default="1" w:styleId="Carpredefinitoparagrafo">
     <w:name w:val="Default Paragraph Font"/>
     <w:uiPriority w:val="1"/>
-    <w:semiHidden/>
     <w:unhideWhenUsed/>
   </w:style>
   <w:style w:type="table" w:default="1" w:styleId="Tabellanormale">
@@ -2762,6 +2843,50 @@
       <w:spacing w:after="100"/>
       <w:ind w:left="220"/>
     </w:pPr>
+  </w:style>
+  <w:style w:type="paragraph" w:styleId="Intestazione">
+    <w:name w:val="header"/>
+    <w:basedOn w:val="Normale"/>
+    <w:link w:val="IntestazioneCarattere"/>
+    <w:uiPriority w:val="99"/>
+    <w:unhideWhenUsed/>
+    <w:rsid w:val="00A6318E"/>
+    <w:pPr>
+      <w:tabs>
+        <w:tab w:val="center" w:pos="4819"/>
+        <w:tab w:val="right" w:pos="9638"/>
+      </w:tabs>
+      <w:spacing w:after="0" w:line="240" w:lineRule="auto"/>
+    </w:pPr>
+  </w:style>
+  <w:style w:type="character" w:customStyle="1" w:styleId="IntestazioneCarattere">
+    <w:name w:val="Intestazione Carattere"/>
+    <w:basedOn w:val="Carpredefinitoparagrafo"/>
+    <w:link w:val="Intestazione"/>
+    <w:uiPriority w:val="99"/>
+    <w:rsid w:val="00A6318E"/>
+  </w:style>
+  <w:style w:type="paragraph" w:styleId="Pidipagina">
+    <w:name w:val="footer"/>
+    <w:basedOn w:val="Normale"/>
+    <w:link w:val="PidipaginaCarattere"/>
+    <w:uiPriority w:val="99"/>
+    <w:unhideWhenUsed/>
+    <w:rsid w:val="00A6318E"/>
+    <w:pPr>
+      <w:tabs>
+        <w:tab w:val="center" w:pos="4819"/>
+        <w:tab w:val="right" w:pos="9638"/>
+      </w:tabs>
+      <w:spacing w:after="0" w:line="240" w:lineRule="auto"/>
+    </w:pPr>
+  </w:style>
+  <w:style w:type="character" w:customStyle="1" w:styleId="PidipaginaCarattere">
+    <w:name w:val="Piè di pagina Carattere"/>
+    <w:basedOn w:val="Carpredefinitoparagrafo"/>
+    <w:link w:val="Pidipagina"/>
+    <w:uiPriority w:val="99"/>
+    <w:rsid w:val="00A6318E"/>
   </w:style>
 </w:styles>
 </file>

</xml_diff>